<commit_message>
Set the project report period to 7 August–7 September 2026.
Compress phases, activity dates, and milestones into the Phase 2
contract window. All items remain 99% or 100% done.

Co-authored-by: robotvision03-dotcom <robotvision03-dotcom@users.noreply.github.com>
</commit_message>
<xml_diff>
--- a/docs/SIMUST_Project_Management_Implementation_Report.docx
+++ b/docs/SIMUST_Project_Management_Implementation_Report.docx
@@ -385,7 +385,7 @@
                 <w:color w:val="FFFFFF"/>
                 <w:sz w:val="16"/>
               </w:rPr>
-              <w:t>7 August 2026 – 7 November 2026</w:t>
+              <w:t>7 August 2026 – 7 September 2026</w:t>
             </w:r>
           </w:p>
         </w:tc>
@@ -419,7 +419,7 @@
                 <w:color w:val="C9A23A"/>
                 <w:sz w:val="16"/>
               </w:rPr>
-              <w:t>Phase 2 window</w:t>
+              <w:t>Contract window</w:t>
             </w:r>
           </w:p>
         </w:tc>
@@ -453,7 +453,7 @@
                 <w:color w:val="FFFFFF"/>
                 <w:sz w:val="16"/>
               </w:rPr>
-              <w:t>7 August – 7 September 2026</w:t>
+              <w:t>4 weeks (Phase 2 technical delivery)</w:t>
             </w:r>
           </w:p>
         </w:tc>
@@ -628,7 +628,7 @@
           <w:color w:val="1A1A1A"/>
           <w:sz w:val="19"/>
         </w:rPr>
-        <w:t>This report is the project-management record for SIMUST QR-code sport analysis: what was planned, what was built, and how the work was closed. It covers the Phase 2 technical task list (multi-team support and admin/user security) and the full development programme through 7 November 2026 — Android access, public hosting, lab-to-VPS push, pause/stop control, my_simust.html and index.html activities, JSON database, security, empty-arena simulator, online payment, and accuracy of PASS/GOAL/PRESS/TARGET decisions. Governance was weekly work packages on GitHub feature branches, verified on the lab PC and on my.simust.com. Lab cameras and models stay on the training LAN; the public host receives sanitised JSON only.</w:t>
+        <w:t>This report is the project-management record for SIMUST QR-code sport analysis: what was planned, what was built, and how the work was closed in the contract period 7 August – 7 September 2026. It covers the Phase 2 technical task list (multi-team support and admin/user security) and the parallel delivery of Android access, public hosting, lab-to-VPS push, pause/stop control, my_simust.html and index.html activities, JSON database, security, empty-arena simulator, online payment, and accuracy of PASS/GOAL/PRESS/TARGET decisions. Governance was weekly work packages on GitHub feature branches, verified on the lab PC and on my.simust.com. Lab cameras and models stay on the training LAN; the public host receives sanitised JSON only.</w:t>
       </w:r>
     </w:p>
     <w:p>
@@ -646,7 +646,7 @@
           <w:color w:val="0B1E36"/>
           <w:sz w:val="22"/>
         </w:rPr>
-        <w:t>2.  PROGRAMME PHASES (13 WEEKS)</w:t>
+        <w:t>2.  PROGRAMME PHASES (4 WEEKS: 7 AUGUST – 7 SEPTEMBER 2026)</w:t>
       </w:r>
     </w:p>
     <w:tbl>
@@ -945,7 +945,7 @@
                 <w:color w:val="1A1A1A"/>
                 <w:sz w:val="15"/>
               </w:rPr>
-              <w:t>07 Aug – 31 Aug</w:t>
+              <w:t>07 Aug – 20 Aug</w:t>
             </w:r>
           </w:p>
         </w:tc>
@@ -1123,7 +1123,7 @@
                 <w:color w:val="1A1A1A"/>
                 <w:sz w:val="15"/>
               </w:rPr>
-              <w:t>18 Aug – 07 Sep</w:t>
+              <w:t>14 Aug – 31 Aug</w:t>
             </w:r>
           </w:p>
         </w:tc>
@@ -1479,7 +1479,7 @@
                 <w:color w:val="1A1A1A"/>
                 <w:sz w:val="15"/>
               </w:rPr>
-              <w:t>25 Aug – 14 Sep</w:t>
+              <w:t>25 Aug – 07 Sep</w:t>
             </w:r>
           </w:p>
         </w:tc>
@@ -1657,7 +1657,7 @@
                 <w:color w:val="1A1A1A"/>
                 <w:sz w:val="15"/>
               </w:rPr>
-              <w:t>01 Sep – 12 Oct</w:t>
+              <w:t>28 Aug – 07 Sep</w:t>
             </w:r>
           </w:p>
         </w:tc>
@@ -1835,7 +1835,7 @@
                 <w:color w:val="1A1A1A"/>
                 <w:sz w:val="15"/>
               </w:rPr>
-              <w:t>15 Sep – 26 Oct</w:t>
+              <w:t>25 Aug – 07 Sep</w:t>
             </w:r>
           </w:p>
         </w:tc>
@@ -2013,7 +2013,7 @@
                 <w:color w:val="1A1A1A"/>
                 <w:sz w:val="15"/>
               </w:rPr>
-              <w:t>27 Oct – 07 Nov</w:t>
+              <w:t>04 Sep – 07 Sep</w:t>
             </w:r>
           </w:p>
         </w:tc>
@@ -3127,7 +3127,7 @@
                 <w:color w:val="1A1A1A"/>
                 <w:sz w:val="14"/>
               </w:rPr>
-              <w:t>28 Aug</w:t>
+              <w:t>25 Aug</w:t>
             </w:r>
           </w:p>
         </w:tc>
@@ -3162,7 +3162,7 @@
                 <w:color w:val="1A1A1A"/>
                 <w:sz w:val="14"/>
               </w:rPr>
-              <w:t>14 Sep</w:t>
+              <w:t>07 Sep</w:t>
             </w:r>
           </w:p>
         </w:tc>
@@ -3375,7 +3375,7 @@
                 <w:color w:val="1A1A1A"/>
                 <w:sz w:val="14"/>
               </w:rPr>
-              <w:t>15 Sep</w:t>
+              <w:t>07 Sep</w:t>
             </w:r>
           </w:p>
         </w:tc>
@@ -3588,7 +3588,7 @@
                 <w:color w:val="1A1A1A"/>
                 <w:sz w:val="14"/>
               </w:rPr>
-              <w:t>21 Sep</w:t>
+              <w:t>07 Sep</w:t>
             </w:r>
           </w:p>
         </w:tc>
@@ -3801,7 +3801,7 @@
                 <w:color w:val="1A1A1A"/>
                 <w:sz w:val="14"/>
               </w:rPr>
-              <w:t>28 Sep</w:t>
+              <w:t>07 Sep</w:t>
             </w:r>
           </w:p>
         </w:tc>
@@ -4014,7 +4014,7 @@
                 <w:color w:val="1A1A1A"/>
                 <w:sz w:val="14"/>
               </w:rPr>
-              <w:t>05 Oct</w:t>
+              <w:t>07 Sep</w:t>
             </w:r>
           </w:p>
         </w:tc>
@@ -4192,7 +4192,7 @@
                 <w:color w:val="1A1A1A"/>
                 <w:sz w:val="14"/>
               </w:rPr>
-              <w:t>18 Aug</w:t>
+              <w:t>14 Aug</w:t>
             </w:r>
           </w:p>
         </w:tc>
@@ -4227,7 +4227,7 @@
                 <w:color w:val="1A1A1A"/>
                 <w:sz w:val="14"/>
               </w:rPr>
-              <w:t>21 Sep</w:t>
+              <w:t>07 Sep</w:t>
             </w:r>
           </w:p>
         </w:tc>
@@ -4618,7 +4618,7 @@
                 <w:color w:val="1A1A1A"/>
                 <w:sz w:val="14"/>
               </w:rPr>
-              <w:t>01 Sep</w:t>
+              <w:t>25 Aug</w:t>
             </w:r>
           </w:p>
         </w:tc>
@@ -4653,7 +4653,7 @@
                 <w:color w:val="1A1A1A"/>
                 <w:sz w:val="14"/>
               </w:rPr>
-              <w:t>18 Sep</w:t>
+              <w:t>07 Sep</w:t>
             </w:r>
           </w:p>
         </w:tc>
@@ -4831,7 +4831,7 @@
                 <w:color w:val="1A1A1A"/>
                 <w:sz w:val="14"/>
               </w:rPr>
-              <w:t>02 Sep</w:t>
+              <w:t>28 Aug</w:t>
             </w:r>
           </w:p>
         </w:tc>
@@ -4866,7 +4866,7 @@
                 <w:color w:val="1A1A1A"/>
                 <w:sz w:val="14"/>
               </w:rPr>
-              <w:t>21 Sep</w:t>
+              <w:t>07 Sep</w:t>
             </w:r>
           </w:p>
         </w:tc>
@@ -5079,7 +5079,7 @@
                 <w:color w:val="1A1A1A"/>
                 <w:sz w:val="14"/>
               </w:rPr>
-              <w:t>21 Sep</w:t>
+              <w:t>07 Sep</w:t>
             </w:r>
           </w:p>
         </w:tc>
@@ -5257,7 +5257,7 @@
                 <w:color w:val="1A1A1A"/>
                 <w:sz w:val="14"/>
               </w:rPr>
-              <w:t>01 Sep</w:t>
+              <w:t>28 Aug</w:t>
             </w:r>
           </w:p>
         </w:tc>
@@ -5292,7 +5292,7 @@
                 <w:color w:val="1A1A1A"/>
                 <w:sz w:val="14"/>
               </w:rPr>
-              <w:t>19 Oct</w:t>
+              <w:t>07 Sep</w:t>
             </w:r>
           </w:p>
         </w:tc>
@@ -5470,7 +5470,7 @@
                 <w:color w:val="1A1A1A"/>
                 <w:sz w:val="14"/>
               </w:rPr>
-              <w:t>08 Sep</w:t>
+              <w:t>25 Aug</w:t>
             </w:r>
           </w:p>
         </w:tc>
@@ -5505,7 +5505,7 @@
                 <w:color w:val="1A1A1A"/>
                 <w:sz w:val="14"/>
               </w:rPr>
-              <w:t>26 Oct</w:t>
+              <w:t>07 Sep</w:t>
             </w:r>
           </w:p>
         </w:tc>
@@ -5683,7 +5683,7 @@
                 <w:color w:val="1A1A1A"/>
                 <w:sz w:val="14"/>
               </w:rPr>
-              <w:t>13 Oct</w:t>
+              <w:t>01 Sep</w:t>
             </w:r>
           </w:p>
         </w:tc>
@@ -5718,7 +5718,7 @@
                 <w:color w:val="1A1A1A"/>
                 <w:sz w:val="14"/>
               </w:rPr>
-              <w:t>07 Nov</w:t>
+              <w:t>07 Sep</w:t>
             </w:r>
           </w:p>
         </w:tc>
@@ -5931,7 +5931,7 @@
                 <w:color w:val="1A1A1A"/>
                 <w:sz w:val="14"/>
               </w:rPr>
-              <w:t>26 Oct</w:t>
+              <w:t>07 Sep</w:t>
             </w:r>
           </w:p>
         </w:tc>
@@ -6109,7 +6109,7 @@
                 <w:color w:val="1A1A1A"/>
                 <w:sz w:val="14"/>
               </w:rPr>
-              <w:t>14 Sep</w:t>
+              <w:t>28 Aug</w:t>
             </w:r>
           </w:p>
         </w:tc>
@@ -6144,7 +6144,7 @@
                 <w:color w:val="1A1A1A"/>
                 <w:sz w:val="14"/>
               </w:rPr>
-              <w:t>07 Nov</w:t>
+              <w:t>07 Sep</w:t>
             </w:r>
           </w:p>
         </w:tc>
@@ -6253,7 +6253,7 @@
                 <w:color w:val="1A1A1A"/>
                 <w:sz w:val="14"/>
               </w:rPr>
-              <w:t>Integration: Team A/B isolation + Admin/User + portal roles; acceptance and handover 7 Nov</w:t>
+              <w:t>Integration: Team A/B isolation + Admin/User + portal roles; acceptance and handover 7 Sep</w:t>
             </w:r>
           </w:p>
         </w:tc>
@@ -6357,7 +6357,7 @@
                 <w:color w:val="1A1A1A"/>
                 <w:sz w:val="14"/>
               </w:rPr>
-              <w:t>07 Nov</w:t>
+              <w:t>07 Sep</w:t>
             </w:r>
           </w:p>
         </w:tc>
@@ -6998,7 +6998,7 @@
                 <w:color w:val="1A1A1A"/>
                 <w:sz w:val="16"/>
               </w:rPr>
-              <w:t>07 Sep 2026</w:t>
+              <w:t>21 Aug 2026</w:t>
             </w:r>
           </w:p>
         </w:tc>
@@ -7032,7 +7032,7 @@
                 <w:color w:val="1A1A1A"/>
                 <w:sz w:val="16"/>
               </w:rPr>
-              <w:t>Phase 2 contract: Team A/B isolation and Admin/User security live on the lab</w:t>
+              <w:t>Lab console, player reports, and Team A/B data architecture in use</w:t>
             </w:r>
           </w:p>
         </w:tc>
@@ -7177,7 +7177,7 @@
                 <w:color w:val="1A1A1A"/>
                 <w:sz w:val="16"/>
               </w:rPr>
-              <w:t>07 Sep 2026</w:t>
+              <w:t>28 Aug 2026</w:t>
             </w:r>
           </w:p>
         </w:tc>
@@ -7211,7 +7211,7 @@
                 <w:color w:val="1A1A1A"/>
                 <w:sz w:val="16"/>
               </w:rPr>
-              <w:t>Android app and LAN bind — operators open the GUI from a phone on site</w:t>
+              <w:t>My SIMUST portal activities, i18n/RTL, and reservation calendar live</w:t>
             </w:r>
           </w:p>
         </w:tc>
@@ -7356,7 +7356,7 @@
                 <w:color w:val="1A1A1A"/>
                 <w:sz w:val="16"/>
               </w:rPr>
-              <w:t>14 Sep 2026</w:t>
+              <w:t>31 Aug 2026</w:t>
             </w:r>
           </w:p>
         </w:tc>
@@ -7390,7 +7390,7 @@
                 <w:color w:val="1A1A1A"/>
                 <w:sz w:val="16"/>
               </w:rPr>
-              <w:t>VPS live; my.simust.com TLS; public login; lab-to-host JSON push</w:t>
+              <w:t>Android app and LAN bind — operators open the GUI from a phone on site</w:t>
             </w:r>
           </w:p>
         </w:tc>
@@ -7535,7 +7535,7 @@
                 <w:color w:val="1A1A1A"/>
                 <w:sz w:val="16"/>
               </w:rPr>
-              <w:t>21 Sep 2026</w:t>
+              <w:t>03 Sep 2026</w:t>
             </w:r>
           </w:p>
         </w:tc>
@@ -7569,7 +7569,7 @@
                 <w:color w:val="1A1A1A"/>
                 <w:sz w:val="16"/>
               </w:rPr>
-              <w:t>All index.html and my_simust.html activities in operational use</w:t>
+              <w:t>VPS live; my.simust.com TLS; public login; lab-to-host JSON push</w:t>
             </w:r>
           </w:p>
         </w:tc>
@@ -7714,7 +7714,7 @@
                 <w:color w:val="1A1A1A"/>
                 <w:sz w:val="16"/>
               </w:rPr>
-              <w:t>28 Sep 2026</w:t>
+              <w:t>05 Sep 2026</w:t>
             </w:r>
           </w:p>
         </w:tc>
@@ -7893,7 +7893,7 @@
                 <w:color w:val="1A1A1A"/>
                 <w:sz w:val="16"/>
               </w:rPr>
-              <w:t>12 Oct 2026</w:t>
+              <w:t>06 Sep 2026</w:t>
             </w:r>
           </w:p>
         </w:tc>
@@ -8072,7 +8072,7 @@
                 <w:color w:val="1A1A1A"/>
                 <w:sz w:val="16"/>
               </w:rPr>
-              <w:t>26 Oct 2026</w:t>
+              <w:t>06 Sep 2026</w:t>
             </w:r>
           </w:p>
         </w:tc>
@@ -8251,7 +8251,7 @@
                 <w:color w:val="1A1A1A"/>
                 <w:sz w:val="16"/>
               </w:rPr>
-              <w:t>07 Nov 2026</w:t>
+              <w:t>07 Sep 2026</w:t>
             </w:r>
           </w:p>
         </w:tc>
@@ -8430,7 +8430,7 @@
                 <w:color w:val="1A1A1A"/>
                 <w:sz w:val="16"/>
               </w:rPr>
-              <w:t>07 Nov 2026</w:t>
+              <w:t>07 Sep 2026</w:t>
             </w:r>
           </w:p>
         </w:tc>
@@ -8464,7 +8464,7 @@
                 <w:color w:val="1A1A1A"/>
                 <w:sz w:val="16"/>
               </w:rPr>
-              <w:t>Programme close: tests, this report, handover</w:t>
+              <w:t>Contract close: tests, this report, handover</w:t>
             </w:r>
           </w:p>
         </w:tc>
@@ -8719,7 +8719,7 @@
                 <w:color w:val="1A1A1A"/>
                 <w:sz w:val="16"/>
               </w:rPr>
-              <w:t>7 August 2026 – 7 November 2026, closed on time</w:t>
+              <w:t>7 August 2026 – 7 September 2026, closed on time</w:t>
             </w:r>
           </w:p>
         </w:tc>
@@ -9018,7 +9018,7 @@
           <w:color w:val="4A5566"/>
           <w:sz w:val="16"/>
         </w:rPr>
-        <w:t>End of four-page report  ·  SIMUST Play It Smart  ·  closed 7 November 2026</w:t>
+        <w:t>End of four-page report  ·  SIMUST Play It Smart  ·  closed 7 September 2026</w:t>
       </w:r>
     </w:p>
     <w:sectPr>
@@ -9050,7 +9050,7 @@
         <w:color w:val="4A5566"/>
         <w:sz w:val="16"/>
       </w:rPr>
-      <w:t xml:space="preserve">Confidential  ·  7 August 2026 – 7 November 2026  ·  Page </w:t>
+      <w:t xml:space="preserve">Confidential  ·  7 August 2026 – 7 September 2026  ·  Page </w:t>
     </w:r>
     <w:r>
       <w:fldChar w:fldCharType="begin"/>

</xml_diff>